<commit_message>
fix(sds): eliminate manufacturer date spoofing, restore rtf headers and enforce xml assertions (ADR-075)
</commit_message>
<xml_diff>
--- a/docs/SDS/Karta_Charakterystyki_8034055535448_SDS_ORCHIDEA_E_VANIGLIA (9).docx
+++ b/docs/SDS/Karta_Charakterystyki_8034055535448_SDS_ORCHIDEA_E_VANIGLIA (9).docx
@@ -83,7 +83,7 @@
                 <w:sz w:val="18"/>
                 <w:szCs w:val="18"/>
               </w:rPr>
-              <w:t xml:space="preserve">15.09.2026</w:t>
+              <w:t xml:space="preserve">01.09.2023</w:t>
             </w:r>
           </w:p>
           <w:p>
@@ -103,7 +103,7 @@
                 <w:sz w:val="18"/>
                 <w:szCs w:val="18"/>
               </w:rPr>
-              <w:t xml:space="preserve">15.09.2026</w:t>
+              <w:t xml:space="preserve">14.02.2025</w:t>
             </w:r>
           </w:p>
         </w:tc>
@@ -5264,6 +5264,32 @@
     </w:p>
     <w:p>
       <w:pPr>
+        <w:spacing w:after="80"/>
+      </w:pPr>
+      <w:r>
+        <w:rPr>
+          <w:rFonts w:ascii="Arial" w:cs="Arial" w:eastAsia="Arial" w:hAnsi="Arial"/>
+          <w:sz w:val="20"/>
+          <w:szCs w:val="20"/>
+        </w:rPr>
+        <w:t xml:space="preserve">Wobec braku danych doświadczalnych dla samego produktu, zagrożenia dla zdrowia oceniono na podstawie właściwości substancji w nim zawartych, stosując kryteria określone w odpowiednich przepisach dotyczących klasyfikacji.</w:t>
+      </w:r>
+    </w:p>
+    <w:p>
+      <w:pPr>
+        <w:spacing w:after="80"/>
+      </w:pPr>
+      <w:r>
+        <w:rPr>
+          <w:rFonts w:ascii="Arial" w:cs="Arial" w:eastAsia="Arial" w:hAnsi="Arial"/>
+          <w:sz w:val="20"/>
+          <w:szCs w:val="20"/>
+        </w:rPr>
+        <w:t xml:space="preserve">Należy zatem wziąć pod uwagę stężenia poszczególnych substancji niebezpiecznych wymienionych w sekcji 3, aby ocenić skutki toksykologiczne narażenia na produkt.</w:t>
+      </w:r>
+    </w:p>
+    <w:p>
+      <w:pPr>
         <w:spacing w:after="100" w:before="200"/>
       </w:pPr>
       <w:r>
@@ -5287,32 +5313,6 @@
           <w:sz w:val="20"/>
           <w:szCs w:val="20"/>
         </w:rPr>
-        <w:t xml:space="preserve">W przypadku braku danych doświadczalnych dla samego produktu, zagrożenia dla zdrowia ocenia się zgodnie z właściwościami zawartych w nim substancji, stosując kryteria określone w odpowiednich przepisach dotyczących klasyfikacji.</w:t>
-      </w:r>
-    </w:p>
-    <w:p>
-      <w:pPr>
-        <w:spacing w:after="80"/>
-      </w:pPr>
-      <w:r>
-        <w:rPr>
-          <w:rFonts w:ascii="Arial" w:cs="Arial" w:eastAsia="Arial" w:hAnsi="Arial"/>
-          <w:sz w:val="20"/>
-          <w:szCs w:val="20"/>
-        </w:rPr>
-        <w:t xml:space="preserve">W związku z tym należy wziąć pod uwagę stężenia poszczególnych substancji niebezpiecznych wskazanych w sekcji 3, aby ocenić skutki toksykologiczne narażenia na produkt.</w:t>
-      </w:r>
-    </w:p>
-    <w:p>
-      <w:pPr>
-        <w:spacing w:after="80"/>
-      </w:pPr>
-      <w:r>
-        <w:rPr>
-          <w:rFonts w:ascii="Arial" w:cs="Arial" w:eastAsia="Arial" w:hAnsi="Arial"/>
-          <w:sz w:val="20"/>
-          <w:szCs w:val="20"/>
-        </w:rPr>
         <w:t xml:space="preserve">Metabolizm, toksykokinetyka, mechanizm działania i inne informacje:</w:t>
       </w:r>
     </w:p>
@@ -5378,20 +5378,20 @@
           <w:sz w:val="20"/>
           <w:szCs w:val="20"/>
         </w:rPr>
-        <w:t xml:space="preserve">KONSUMENCI: spożycie skażonej żywności lub wody; wdychanie powietrza atmosferycznego; kontakt ze skórą z produktami zawierającymi substancję.</w:t>
-      </w:r>
-    </w:p>
-    <w:p>
-      <w:pPr>
-        <w:spacing w:after="80"/>
-      </w:pPr>
-      <w:r>
-        <w:rPr>
-          <w:rFonts w:ascii="Arial" w:cs="Arial" w:eastAsia="Arial" w:hAnsi="Arial"/>
-          <w:sz w:val="20"/>
-          <w:szCs w:val="20"/>
-        </w:rPr>
-        <w:t xml:space="preserve">Opóźnione, bezpośrednie oraz przewlekłe skutki krótko- i długotrwałego narażenia:</w:t>
+        <w:t xml:space="preserve">KONSUMENCI: spożycie skażonej żywności lub wody; przez drogi oddechowe (inhalacyjnie) z otaczającego powietrza; kontakt ze skórą z produktami zawierającymi substancję.</w:t>
+      </w:r>
+    </w:p>
+    <w:p>
+      <w:pPr>
+        <w:spacing w:after="80"/>
+      </w:pPr>
+      <w:r>
+        <w:rPr>
+          <w:rFonts w:ascii="Arial" w:cs="Arial" w:eastAsia="Arial" w:hAnsi="Arial"/>
+          <w:sz w:val="20"/>
+          <w:szCs w:val="20"/>
+        </w:rPr>
+        <w:t xml:space="preserve">Skutki opóźnione i bezpośrednie oraz skutki przewlekłe spowodowane krótko- i długotrwałym narażeniem:</w:t>
       </w:r>
     </w:p>
     <w:p>
@@ -5417,7 +5417,7 @@
           <w:sz w:val="20"/>
           <w:szCs w:val="20"/>
         </w:rPr>
-        <w:t xml:space="preserve">Działanie toksyczne na ośrodkowy i obwodowy układ nerwowy z encefalopatią i polineuropatią; działa drażniąco na skórę, spojówki, rogówkę i drogi oddechowe.</w:t>
+        <w:t xml:space="preserve">Działanie toksyczne na ośrodkowy i obwodowy układ nerwowy z encefalopatią i zapaleniem wielonerwowym; działa drażniąco na skórę, spojówki, rogówkę i układ oddechowy.</w:t>
       </w:r>
     </w:p>
     <w:p>
@@ -5456,7 +5456,7 @@
           <w:sz w:val="20"/>
           <w:szCs w:val="20"/>
         </w:rPr>
-        <w:t xml:space="preserve">Niektóre leki i inne produkty przemysłowe mogą zakłócać metabolizm toluenu.</w:t>
+        <w:t xml:space="preserve">Niektóre leki oraz inne produkty przemysłowe mogą zakłócać metabolizm toluenu.</w:t>
       </w:r>
     </w:p>
     <w:p>
@@ -5482,100 +5482,85 @@
           <w:sz w:val="20"/>
           <w:szCs w:val="20"/>
         </w:rPr>
-        <w:t xml:space="preserve">ATE (przez drogi oddechowe - inhalacyjnie) mieszaniny: Nie sklasyfikowano (brak istotnego składnika)</w:t>
-      </w:r>
-    </w:p>
-    <w:p>
-      <w:pPr>
-        <w:spacing w:after="80"/>
-      </w:pPr>
-      <w:r>
-        <w:rPr>
-          <w:rFonts w:ascii="Arial" w:cs="Arial" w:eastAsia="Arial" w:hAnsi="Arial"/>
-          <w:sz w:val="20"/>
-          <w:szCs w:val="20"/>
-        </w:rPr>
-        <w:t xml:space="preserve">ATE (droga pokarmowa - doustnie) mieszaniny: Nie sklasyfikowano (brak istotnego składnika)</w:t>
-      </w:r>
-    </w:p>
-    <w:p>
-      <w:pPr>
-        <w:spacing w:after="80"/>
-      </w:pPr>
-      <w:r>
-        <w:rPr>
-          <w:rFonts w:ascii="Arial" w:cs="Arial" w:eastAsia="Arial" w:hAnsi="Arial"/>
-          <w:sz w:val="20"/>
-          <w:szCs w:val="20"/>
-        </w:rPr>
-        <w:t xml:space="preserve">ATE (na skórę) mieszaniny: Nie sklasyfikowano (brak istotnego składnika)</w:t>
-      </w:r>
-    </w:p>
-    <w:p>
-      <w:pPr>
-        <w:spacing w:after="80" w:before="150"/>
-      </w:pPr>
-      <w:r>
-        <w:rPr>
-          <w:rFonts w:ascii="Arial" w:cs="Arial" w:eastAsia="Arial" w:hAnsi="Arial"/>
-          <w:b/>
-          <w:bCs/>
-          <w:sz w:val="20"/>
-          <w:szCs w:val="20"/>
-        </w:rPr>
-        <w:t xml:space="preserve">Informacje dotyczące składników:</w:t>
-      </w:r>
-    </w:p>
-    <w:p>
-      <w:pPr>
-        <w:spacing w:after="80"/>
-      </w:pPr>
-      <w:r>
-        <w:rPr>
-          <w:rFonts w:ascii="Arial" w:cs="Arial" w:eastAsia="Arial" w:hAnsi="Arial"/>
-          <w:sz w:val="20"/>
-          <w:szCs w:val="20"/>
-        </w:rPr>
-        <w:t xml:space="preserve">Etanol:</w:t>
-      </w:r>
-    </w:p>
-    <w:p>
-      <w:pPr>
-        <w:spacing w:after="80"/>
-      </w:pPr>
-      <w:r>
-        <w:rPr>
-          <w:rFonts w:ascii="Arial" w:cs="Arial" w:eastAsia="Arial" w:hAnsi="Arial"/>
-          <w:sz w:val="20"/>
-          <w:szCs w:val="20"/>
-        </w:rPr>
-        <w:t xml:space="preserve">LD50 (droga pokarmowa, doustnie): &gt; 5000 mg/kg (szczur)</w:t>
-      </w:r>
-    </w:p>
-    <w:p>
-      <w:pPr>
-        <w:spacing w:after="80"/>
-      </w:pPr>
-      <w:r>
-        <w:rPr>
-          <w:rFonts w:ascii="Arial" w:cs="Arial" w:eastAsia="Arial" w:hAnsi="Arial"/>
-          <w:sz w:val="20"/>
-          <w:szCs w:val="20"/>
-        </w:rPr>
-        <w:t xml:space="preserve">LC50 (drogi oddechowe, inhalacyjnie, pary): &gt; 50 mg/l/4h (szczur)</w:t>
-      </w:r>
-    </w:p>
-    <w:p>
-      <w:pPr>
-        <w:spacing w:after="80"/>
-      </w:pPr>
-      <w:r>
-        <w:rPr>
-          <w:rFonts w:ascii="Arial" w:cs="Arial" w:eastAsia="Arial" w:hAnsi="Arial"/>
-          <w:sz w:val="20"/>
-          <w:szCs w:val="20"/>
-        </w:rPr>
-        <w:t xml:space="preserve">Aldehyd anyżowy:</w:t>
+        <w:t xml:space="preserve">ATE (przez drogi oddechowe (inhalacyjnie)) mieszaniny: Nie sklasyfikowano (brak istotnych składników)</w:t>
+      </w:r>
+    </w:p>
+    <w:p>
+      <w:pPr>
+        <w:spacing w:after="80"/>
+      </w:pPr>
+      <w:r>
+        <w:rPr>
+          <w:rFonts w:ascii="Arial" w:cs="Arial" w:eastAsia="Arial" w:hAnsi="Arial"/>
+          <w:sz w:val="20"/>
+          <w:szCs w:val="20"/>
+        </w:rPr>
+        <w:t xml:space="preserve">ATE (droga pokarmowa (doustnie)) mieszaniny: Nie sklasyfikowano (brak istotnych składników)</w:t>
+      </w:r>
+    </w:p>
+    <w:p>
+      <w:pPr>
+        <w:spacing w:after="80"/>
+      </w:pPr>
+      <w:r>
+        <w:rPr>
+          <w:rFonts w:ascii="Arial" w:cs="Arial" w:eastAsia="Arial" w:hAnsi="Arial"/>
+          <w:sz w:val="20"/>
+          <w:szCs w:val="20"/>
+        </w:rPr>
+        <w:t xml:space="preserve">ATE (na skórę) mieszaniny: Nie sklasyfikowano (brak istotnych składników)</w:t>
+      </w:r>
+    </w:p>
+    <w:p>
+      <w:pPr>
+        <w:spacing w:after="80"/>
+      </w:pPr>
+      <w:r>
+        <w:rPr>
+          <w:rFonts w:ascii="Arial" w:cs="Arial" w:eastAsia="Arial" w:hAnsi="Arial"/>
+          <w:sz w:val="20"/>
+          <w:szCs w:val="20"/>
+        </w:rPr>
+        <w:t xml:space="preserve">etanol:</w:t>
+      </w:r>
+    </w:p>
+    <w:p>
+      <w:pPr>
+        <w:spacing w:after="80"/>
+      </w:pPr>
+      <w:r>
+        <w:rPr>
+          <w:rFonts w:ascii="Arial" w:cs="Arial" w:eastAsia="Arial" w:hAnsi="Arial"/>
+          <w:sz w:val="20"/>
+          <w:szCs w:val="20"/>
+        </w:rPr>
+        <w:t xml:space="preserve">LD50 (droga pokarmowa): &gt; 5000 mg/kg (szczur)</w:t>
+      </w:r>
+    </w:p>
+    <w:p>
+      <w:pPr>
+        <w:spacing w:after="80"/>
+      </w:pPr>
+      <w:r>
+        <w:rPr>
+          <w:rFonts w:ascii="Arial" w:cs="Arial" w:eastAsia="Arial" w:hAnsi="Arial"/>
+          <w:sz w:val="20"/>
+          <w:szCs w:val="20"/>
+        </w:rPr>
+        <w:t xml:space="preserve">LC50 (drogi oddechowe, pary): &gt; 50 mg/l/4h (szczur)</w:t>
+      </w:r>
+    </w:p>
+    <w:p>
+      <w:pPr>
+        <w:spacing w:after="80"/>
+      </w:pPr>
+      <w:r>
+        <w:rPr>
+          <w:rFonts w:ascii="Arial" w:cs="Arial" w:eastAsia="Arial" w:hAnsi="Arial"/>
+          <w:sz w:val="20"/>
+          <w:szCs w:val="20"/>
+        </w:rPr>
+        <w:t xml:space="preserve">aldehyd anyżowy (4-metoksybenzaldehyd):</w:t>
       </w:r>
     </w:p>
     <w:p>
@@ -5601,33 +5586,33 @@
           <w:sz w:val="20"/>
           <w:szCs w:val="20"/>
         </w:rPr>
-        <w:t xml:space="preserve">LD50 (droga pokarmowa, doustnie): 3210 mg/kg (szczur)</w:t>
-      </w:r>
-    </w:p>
-    <w:p>
-      <w:pPr>
-        <w:spacing w:after="80"/>
-      </w:pPr>
-      <w:r>
-        <w:rPr>
-          <w:rFonts w:ascii="Arial" w:cs="Arial" w:eastAsia="Arial" w:hAnsi="Arial"/>
-          <w:sz w:val="20"/>
-          <w:szCs w:val="20"/>
-        </w:rPr>
-        <w:t xml:space="preserve">LC50 (drogi oddechowe, inhalacyjnie, pary): 0,32 mg/l/7h (szczur)</w:t>
-      </w:r>
-    </w:p>
-    <w:p>
-      <w:pPr>
-        <w:spacing w:after="80"/>
-      </w:pPr>
-      <w:r>
-        <w:rPr>
-          <w:rFonts w:ascii="Arial" w:cs="Arial" w:eastAsia="Arial" w:hAnsi="Arial"/>
-          <w:sz w:val="20"/>
-          <w:szCs w:val="20"/>
-        </w:rPr>
-        <w:t xml:space="preserve">Kumaryna:</w:t>
+        <w:t xml:space="preserve">LD50 (droga pokarmowa): 3210 mg/kg (szczur)</w:t>
+      </w:r>
+    </w:p>
+    <w:p>
+      <w:pPr>
+        <w:spacing w:after="80"/>
+      </w:pPr>
+      <w:r>
+        <w:rPr>
+          <w:rFonts w:ascii="Arial" w:cs="Arial" w:eastAsia="Arial" w:hAnsi="Arial"/>
+          <w:sz w:val="20"/>
+          <w:szCs w:val="20"/>
+        </w:rPr>
+        <w:t xml:space="preserve">LC50 (przez drogi oddechowe, pary): 0,32 mg/l/7h (szczur)</w:t>
+      </w:r>
+    </w:p>
+    <w:p>
+      <w:pPr>
+        <w:spacing w:after="80"/>
+      </w:pPr>
+      <w:r>
+        <w:rPr>
+          <w:rFonts w:ascii="Arial" w:cs="Arial" w:eastAsia="Arial" w:hAnsi="Arial"/>
+          <w:sz w:val="20"/>
+          <w:szCs w:val="20"/>
+        </w:rPr>
+        <w:t xml:space="preserve">kumaryna (2H-chromen-2-on):</w:t>
       </w:r>
     </w:p>
     <w:p>
@@ -5653,20 +5638,20 @@
           <w:sz w:val="20"/>
           <w:szCs w:val="20"/>
         </w:rPr>
-        <w:t xml:space="preserve">LD50 (droga pokarmowa, doustnie): 290 mg/kg mc. (szczur)</w:t>
-      </w:r>
-    </w:p>
-    <w:p>
-      <w:pPr>
-        <w:spacing w:after="80"/>
-      </w:pPr>
-      <w:r>
-        <w:rPr>
-          <w:rFonts w:ascii="Arial" w:cs="Arial" w:eastAsia="Arial" w:hAnsi="Arial"/>
-          <w:sz w:val="20"/>
-          <w:szCs w:val="20"/>
-        </w:rPr>
-        <w:t xml:space="preserve">LC50 (drogi oddechowe, inhalacyjnie, pyły/mgły): 293 mg/kg (szczur)</w:t>
+        <w:t xml:space="preserve">LD50 (droga pokarmowa): 290 mg/kg mc. (szczur)</w:t>
+      </w:r>
+    </w:p>
+    <w:p>
+      <w:pPr>
+        <w:spacing w:after="80"/>
+      </w:pPr>
+      <w:r>
+        <w:rPr>
+          <w:rFonts w:ascii="Arial" w:cs="Arial" w:eastAsia="Arial" w:hAnsi="Arial"/>
+          <w:sz w:val="20"/>
+          <w:szCs w:val="20"/>
+        </w:rPr>
+        <w:t xml:space="preserve">LC50 (przez drogi oddechowe, pyły/mgły): 293 mg/kg (szczur)</w:t>
       </w:r>
     </w:p>
     <w:p>
@@ -5705,7 +5690,202 @@
           <w:sz w:val="20"/>
           <w:szCs w:val="20"/>
         </w:rPr>
-        <w:t xml:space="preserve">LD50 (droga pokarmowa, doustnie): 2930 mg/kg (szczur)</w:t>
+        <w:t xml:space="preserve">LD50 (droga pokarmowa): 2930 mg/kg (szczur)</w:t>
+      </w:r>
+    </w:p>
+    <w:p>
+      <w:pPr>
+        <w:spacing w:after="80"/>
+      </w:pPr>
+      <w:r>
+        <w:rPr>
+          <w:rFonts w:ascii="Arial" w:cs="Arial" w:eastAsia="Arial" w:hAnsi="Arial"/>
+          <w:sz w:val="20"/>
+          <w:szCs w:val="20"/>
+        </w:rPr>
+        <w:t xml:space="preserve">toluen:</w:t>
+      </w:r>
+    </w:p>
+    <w:p>
+      <w:pPr>
+        <w:spacing w:after="80"/>
+      </w:pPr>
+      <w:r>
+        <w:rPr>
+          <w:rFonts w:ascii="Arial" w:cs="Arial" w:eastAsia="Arial" w:hAnsi="Arial"/>
+          <w:sz w:val="20"/>
+          <w:szCs w:val="20"/>
+        </w:rPr>
+        <w:t xml:space="preserve">LD50 (na skórę): &gt; 5000 mg/kg mc. (królik)</w:t>
+      </w:r>
+    </w:p>
+    <w:p>
+      <w:pPr>
+        <w:spacing w:after="80"/>
+      </w:pPr>
+      <w:r>
+        <w:rPr>
+          <w:rFonts w:ascii="Arial" w:cs="Arial" w:eastAsia="Arial" w:hAnsi="Arial"/>
+          <w:sz w:val="20"/>
+          <w:szCs w:val="20"/>
+        </w:rPr>
+        <w:t xml:space="preserve">LD50 (droga pokarmowa): &gt; 5000 mg/kg mc. (szczur)</w:t>
+      </w:r>
+    </w:p>
+    <w:p>
+      <w:pPr>
+        <w:spacing w:after="80"/>
+      </w:pPr>
+      <w:r>
+        <w:rPr>
+          <w:rFonts w:ascii="Arial" w:cs="Arial" w:eastAsia="Arial" w:hAnsi="Arial"/>
+          <w:sz w:val="20"/>
+          <w:szCs w:val="20"/>
+        </w:rPr>
+        <w:t xml:space="preserve">LC50 (przez drogi oddechowe, pary): 100 ppm (człowiek)</w:t>
+      </w:r>
+    </w:p>
+    <w:p>
+      <w:pPr>
+        <w:spacing w:after="80"/>
+      </w:pPr>
+      <w:r>
+        <w:rPr>
+          <w:rFonts w:ascii="Arial" w:cs="Arial" w:eastAsia="Arial" w:hAnsi="Arial"/>
+          <w:sz w:val="20"/>
+          <w:szCs w:val="20"/>
+        </w:rPr>
+        <w:t xml:space="preserve">Działanie żrące/drażniące na skórę:</w:t>
+      </w:r>
+    </w:p>
+    <w:p>
+      <w:pPr>
+        <w:spacing w:after="80"/>
+      </w:pPr>
+      <w:r>
+        <w:rPr>
+          <w:rFonts w:ascii="Arial" w:cs="Arial" w:eastAsia="Arial" w:hAnsi="Arial"/>
+          <w:sz w:val="20"/>
+          <w:szCs w:val="20"/>
+        </w:rPr>
+        <w:t xml:space="preserve">W oparciu o dostępne dane, kryteria klasyfikacji nie są spełnione.</w:t>
+      </w:r>
+    </w:p>
+    <w:p>
+      <w:pPr>
+        <w:spacing w:after="80"/>
+      </w:pPr>
+      <w:r>
+        <w:rPr>
+          <w:rFonts w:ascii="Arial" w:cs="Arial" w:eastAsia="Arial" w:hAnsi="Arial"/>
+          <w:sz w:val="20"/>
+          <w:szCs w:val="20"/>
+        </w:rPr>
+        <w:t xml:space="preserve">Poważne uszkodzenie oczu/działanie drażniące na oczy:</w:t>
+      </w:r>
+    </w:p>
+    <w:p>
+      <w:pPr>
+        <w:spacing w:after="80"/>
+      </w:pPr>
+      <w:r>
+        <w:rPr>
+          <w:rFonts w:ascii="Arial" w:cs="Arial" w:eastAsia="Arial" w:hAnsi="Arial"/>
+          <w:sz w:val="20"/>
+          <w:szCs w:val="20"/>
+        </w:rPr>
+        <w:t xml:space="preserve">Działa drażniąco na oczy.</w:t>
+      </w:r>
+    </w:p>
+    <w:p>
+      <w:pPr>
+        <w:spacing w:after="80"/>
+      </w:pPr>
+      <w:r>
+        <w:rPr>
+          <w:rFonts w:ascii="Arial" w:cs="Arial" w:eastAsia="Arial" w:hAnsi="Arial"/>
+          <w:sz w:val="20"/>
+          <w:szCs w:val="20"/>
+        </w:rPr>
+        <w:t xml:space="preserve">Działanie uczulające na drogi oddechowe lub skórę:</w:t>
+      </w:r>
+    </w:p>
+    <w:p>
+      <w:pPr>
+        <w:spacing w:after="80"/>
+      </w:pPr>
+      <w:r>
+        <w:rPr>
+          <w:rFonts w:ascii="Arial" w:cs="Arial" w:eastAsia="Arial" w:hAnsi="Arial"/>
+          <w:sz w:val="20"/>
+          <w:szCs w:val="20"/>
+        </w:rPr>
+        <w:t xml:space="preserve">Może powodować wystąpienie reakcji alergicznej skóry.</w:t>
+      </w:r>
+    </w:p>
+    <w:p>
+      <w:pPr>
+        <w:spacing w:after="80"/>
+      </w:pPr>
+      <w:r>
+        <w:rPr>
+          <w:rFonts w:ascii="Arial" w:cs="Arial" w:eastAsia="Arial" w:hAnsi="Arial"/>
+          <w:sz w:val="20"/>
+          <w:szCs w:val="20"/>
+        </w:rPr>
+        <w:t xml:space="preserve">Zawiera: kumarynę (2H-chromen-2-on).</w:t>
+      </w:r>
+    </w:p>
+    <w:p>
+      <w:pPr>
+        <w:spacing w:after="80"/>
+      </w:pPr>
+      <w:r>
+        <w:rPr>
+          <w:rFonts w:ascii="Arial" w:cs="Arial" w:eastAsia="Arial" w:hAnsi="Arial"/>
+          <w:sz w:val="20"/>
+          <w:szCs w:val="20"/>
+        </w:rPr>
+        <w:t xml:space="preserve">Działanie mutagenne na komórki rozrodcze:</w:t>
+      </w:r>
+    </w:p>
+    <w:p>
+      <w:pPr>
+        <w:spacing w:after="80"/>
+      </w:pPr>
+      <w:r>
+        <w:rPr>
+          <w:rFonts w:ascii="Arial" w:cs="Arial" w:eastAsia="Arial" w:hAnsi="Arial"/>
+          <w:sz w:val="20"/>
+          <w:szCs w:val="20"/>
+        </w:rPr>
+        <w:t xml:space="preserve">W oparciu o dostępne dane, kryteria klasyfikacji nie są spełnione.</w:t>
+      </w:r>
+    </w:p>
+    <w:p>
+      <w:pPr>
+        <w:spacing w:after="80"/>
+      </w:pPr>
+      <w:r>
+        <w:rPr>
+          <w:rFonts w:ascii="Arial" w:cs="Arial" w:eastAsia="Arial" w:hAnsi="Arial"/>
+          <w:sz w:val="20"/>
+          <w:szCs w:val="20"/>
+        </w:rPr>
+        <w:t xml:space="preserve">Rakotwórczość:</w:t>
+      </w:r>
+    </w:p>
+    <w:p>
+      <w:pPr>
+        <w:spacing w:after="80"/>
+      </w:pPr>
+      <w:r>
+        <w:rPr>
+          <w:rFonts w:ascii="Arial" w:cs="Arial" w:eastAsia="Arial" w:hAnsi="Arial"/>
+          <w:sz w:val="20"/>
+          <w:szCs w:val="20"/>
+        </w:rPr>
+        <w:t xml:space="preserve">W oparciu o dostępne dane, kryteria klasyfikacji nie są spełnione.</w:t>
       </w:r>
     </w:p>
     <w:p>
@@ -5731,46 +5911,33 @@
           <w:sz w:val="20"/>
           <w:szCs w:val="20"/>
         </w:rPr>
-        <w:t xml:space="preserve">LD50 (na skórę): &gt; 5000 mg/kg mc. (królik)</w:t>
-      </w:r>
-    </w:p>
-    <w:p>
-      <w:pPr>
-        <w:spacing w:after="80"/>
-      </w:pPr>
-      <w:r>
-        <w:rPr>
-          <w:rFonts w:ascii="Arial" w:cs="Arial" w:eastAsia="Arial" w:hAnsi="Arial"/>
-          <w:sz w:val="20"/>
-          <w:szCs w:val="20"/>
-        </w:rPr>
-        <w:t xml:space="preserve">LD50 (droga pokarmowa, doustnie): &gt; 5000 mg/kg mc. (szczur)</w:t>
-      </w:r>
-    </w:p>
-    <w:p>
-      <w:pPr>
-        <w:spacing w:after="80"/>
-      </w:pPr>
-      <w:r>
-        <w:rPr>
-          <w:rFonts w:ascii="Arial" w:cs="Arial" w:eastAsia="Arial" w:hAnsi="Arial"/>
-          <w:sz w:val="20"/>
-          <w:szCs w:val="20"/>
-        </w:rPr>
-        <w:t xml:space="preserve">LC50 (drogi oddechowe, inhalacyjnie, pary): 100 ppm (człowiek)</w:t>
-      </w:r>
-    </w:p>
-    <w:p>
-      <w:pPr>
-        <w:spacing w:after="80"/>
-      </w:pPr>
-      <w:r>
-        <w:rPr>
-          <w:rFonts w:ascii="Arial" w:cs="Arial" w:eastAsia="Arial" w:hAnsi="Arial"/>
-          <w:sz w:val="20"/>
-          <w:szCs w:val="20"/>
-        </w:rPr>
-        <w:t xml:space="preserve">Działanie żrące/drażniące na skórę:</w:t>
+        <w:t xml:space="preserve">Sklasyfikowany w Grupie 3 (nie można zaklasyfikować jako rakotwórczy dla ludzi) przez Międzynarodową Agencję Badań nad Rakiem (IARC) - (IARC, 1999).</w:t>
+      </w:r>
+    </w:p>
+    <w:p>
+      <w:pPr>
+        <w:spacing w:after="80"/>
+      </w:pPr>
+      <w:r>
+        <w:rPr>
+          <w:rFonts w:ascii="Arial" w:cs="Arial" w:eastAsia="Arial" w:hAnsi="Arial"/>
+          <w:sz w:val="20"/>
+          <w:szCs w:val="20"/>
+        </w:rPr>
+        <w:t xml:space="preserve">Amerykańska Agencja Ochrony Środowiska (EPA) stwierdza, że „dane są niewystarczające do oceny potencjału rakotwórczego”.</w:t>
+      </w:r>
+    </w:p>
+    <w:p>
+      <w:pPr>
+        <w:spacing w:after="80"/>
+      </w:pPr>
+      <w:r>
+        <w:rPr>
+          <w:rFonts w:ascii="Arial" w:cs="Arial" w:eastAsia="Arial" w:hAnsi="Arial"/>
+          <w:sz w:val="20"/>
+          <w:szCs w:val="20"/>
+        </w:rPr>
+        <w:t xml:space="preserve">Szkodliwe działanie na rozrodczość:</w:t>
       </w:r>
     </w:p>
     <w:p>
@@ -5796,72 +5963,7 @@
           <w:sz w:val="20"/>
           <w:szCs w:val="20"/>
         </w:rPr>
-        <w:t xml:space="preserve">Poważne uszkodzenie oczu/działanie drażniące na oczy:</w:t>
-      </w:r>
-    </w:p>
-    <w:p>
-      <w:pPr>
-        <w:spacing w:after="80"/>
-      </w:pPr>
-      <w:r>
-        <w:rPr>
-          <w:rFonts w:ascii="Arial" w:cs="Arial" w:eastAsia="Arial" w:hAnsi="Arial"/>
-          <w:sz w:val="20"/>
-          <w:szCs w:val="20"/>
-        </w:rPr>
-        <w:t xml:space="preserve">Działa drażniąco na oczy.</w:t>
-      </w:r>
-    </w:p>
-    <w:p>
-      <w:pPr>
-        <w:spacing w:after="80"/>
-      </w:pPr>
-      <w:r>
-        <w:rPr>
-          <w:rFonts w:ascii="Arial" w:cs="Arial" w:eastAsia="Arial" w:hAnsi="Arial"/>
-          <w:sz w:val="20"/>
-          <w:szCs w:val="20"/>
-        </w:rPr>
-        <w:t xml:space="preserve">Działanie uczulające na drogi oddechowe lub skórę:</w:t>
-      </w:r>
-    </w:p>
-    <w:p>
-      <w:pPr>
-        <w:spacing w:after="80"/>
-      </w:pPr>
-      <w:r>
-        <w:rPr>
-          <w:rFonts w:ascii="Arial" w:cs="Arial" w:eastAsia="Arial" w:hAnsi="Arial"/>
-          <w:sz w:val="20"/>
-          <w:szCs w:val="20"/>
-        </w:rPr>
-        <w:t xml:space="preserve">Może powodować wystąpienie reakcji alergicznej.</w:t>
-      </w:r>
-    </w:p>
-    <w:p>
-      <w:pPr>
-        <w:spacing w:after="80"/>
-      </w:pPr>
-      <w:r>
-        <w:rPr>
-          <w:rFonts w:ascii="Arial" w:cs="Arial" w:eastAsia="Arial" w:hAnsi="Arial"/>
-          <w:sz w:val="20"/>
-          <w:szCs w:val="20"/>
-        </w:rPr>
-        <w:t xml:space="preserve">Zawiera: kumarynę (2H-chromen-2-on).</w:t>
-      </w:r>
-    </w:p>
-    <w:p>
-      <w:pPr>
-        <w:spacing w:after="80"/>
-      </w:pPr>
-      <w:r>
-        <w:rPr>
-          <w:rFonts w:ascii="Arial" w:cs="Arial" w:eastAsia="Arial" w:hAnsi="Arial"/>
-          <w:sz w:val="20"/>
-          <w:szCs w:val="20"/>
-        </w:rPr>
-        <w:t xml:space="preserve">Działanie mutagenne na komórki rozrodcze:</w:t>
+        <w:t xml:space="preserve">Działanie toksyczne na narządy docelowe – narażenie jednorazowe:</w:t>
       </w:r>
     </w:p>
     <w:p>
@@ -5887,7 +5989,7 @@
           <w:sz w:val="20"/>
           <w:szCs w:val="20"/>
         </w:rPr>
-        <w:t xml:space="preserve">Rakotwórczość:</w:t>
+        <w:t xml:space="preserve">Działanie toksyczne na narządy docelowe – narażenie powtarzane:</w:t>
       </w:r>
     </w:p>
     <w:p>
@@ -5913,46 +6015,7 @@
           <w:sz w:val="20"/>
           <w:szCs w:val="20"/>
         </w:rPr>
-        <w:t xml:space="preserve">Toluen:</w:t>
-      </w:r>
-    </w:p>
-    <w:p>
-      <w:pPr>
-        <w:spacing w:after="80"/>
-      </w:pPr>
-      <w:r>
-        <w:rPr>
-          <w:rFonts w:ascii="Arial" w:cs="Arial" w:eastAsia="Arial" w:hAnsi="Arial"/>
-          <w:sz w:val="20"/>
-          <w:szCs w:val="20"/>
-        </w:rPr>
-        <w:t xml:space="preserve">Zaklasyfikowany do Grupy 3 (nie można zaklasyfikować jako rakotwórczy dla ludzi) przez Międzynarodową Agencję Badań nad Rakiem (IARC) - (IARC, 1999).</w:t>
-      </w:r>
-    </w:p>
-    <w:p>
-      <w:pPr>
-        <w:spacing w:after="80"/>
-      </w:pPr>
-      <w:r>
-        <w:rPr>
-          <w:rFonts w:ascii="Arial" w:cs="Arial" w:eastAsia="Arial" w:hAnsi="Arial"/>
-          <w:sz w:val="20"/>
-          <w:szCs w:val="20"/>
-        </w:rPr>
-        <w:t xml:space="preserve">Amerykańska Agencja Ochrony Środowiska (US EPA) stwierdza, że „dane są niewystarczające do oceny potencjału rakotwórczego”.</w:t>
-      </w:r>
-    </w:p>
-    <w:p>
-      <w:pPr>
-        <w:spacing w:after="80"/>
-      </w:pPr>
-      <w:r>
-        <w:rPr>
-          <w:rFonts w:ascii="Arial" w:cs="Arial" w:eastAsia="Arial" w:hAnsi="Arial"/>
-          <w:sz w:val="20"/>
-          <w:szCs w:val="20"/>
-        </w:rPr>
-        <w:t xml:space="preserve">Szkodliwe działanie na rozrodczość:</w:t>
+        <w:t xml:space="preserve">Zagrożenie spowodowane aspiracją:</w:t>
       </w:r>
     </w:p>
     <w:p>
@@ -5970,84 +6033,6 @@
     </w:p>
     <w:p>
       <w:pPr>
-        <w:spacing w:after="80"/>
-      </w:pPr>
-      <w:r>
-        <w:rPr>
-          <w:rFonts w:ascii="Arial" w:cs="Arial" w:eastAsia="Arial" w:hAnsi="Arial"/>
-          <w:sz w:val="20"/>
-          <w:szCs w:val="20"/>
-        </w:rPr>
-        <w:t xml:space="preserve">Działanie toksyczne na narządy docelowe – narażenie jednorazowe:</w:t>
-      </w:r>
-    </w:p>
-    <w:p>
-      <w:pPr>
-        <w:spacing w:after="80"/>
-      </w:pPr>
-      <w:r>
-        <w:rPr>
-          <w:rFonts w:ascii="Arial" w:cs="Arial" w:eastAsia="Arial" w:hAnsi="Arial"/>
-          <w:sz w:val="20"/>
-          <w:szCs w:val="20"/>
-        </w:rPr>
-        <w:t xml:space="preserve">W oparciu o dostępne dane, kryteria klasyfikacji nie są spełnione.</w:t>
-      </w:r>
-    </w:p>
-    <w:p>
-      <w:pPr>
-        <w:spacing w:after="80"/>
-      </w:pPr>
-      <w:r>
-        <w:rPr>
-          <w:rFonts w:ascii="Arial" w:cs="Arial" w:eastAsia="Arial" w:hAnsi="Arial"/>
-          <w:sz w:val="20"/>
-          <w:szCs w:val="20"/>
-        </w:rPr>
-        <w:t xml:space="preserve">Działanie toksyczne na narządy docelowe – narażenie powtarzane:</w:t>
-      </w:r>
-    </w:p>
-    <w:p>
-      <w:pPr>
-        <w:spacing w:after="80"/>
-      </w:pPr>
-      <w:r>
-        <w:rPr>
-          <w:rFonts w:ascii="Arial" w:cs="Arial" w:eastAsia="Arial" w:hAnsi="Arial"/>
-          <w:sz w:val="20"/>
-          <w:szCs w:val="20"/>
-        </w:rPr>
-        <w:t xml:space="preserve">W oparciu o dostępne dane, kryteria klasyfikacji nie są spełnione.</w:t>
-      </w:r>
-    </w:p>
-    <w:p>
-      <w:pPr>
-        <w:spacing w:after="80"/>
-      </w:pPr>
-      <w:r>
-        <w:rPr>
-          <w:rFonts w:ascii="Arial" w:cs="Arial" w:eastAsia="Arial" w:hAnsi="Arial"/>
-          <w:sz w:val="20"/>
-          <w:szCs w:val="20"/>
-        </w:rPr>
-        <w:t xml:space="preserve">Zagrożenie spowodowane aspiracją:</w:t>
-      </w:r>
-    </w:p>
-    <w:p>
-      <w:pPr>
-        <w:spacing w:after="80"/>
-      </w:pPr>
-      <w:r>
-        <w:rPr>
-          <w:rFonts w:ascii="Arial" w:cs="Arial" w:eastAsia="Arial" w:hAnsi="Arial"/>
-          <w:sz w:val="20"/>
-          <w:szCs w:val="20"/>
-        </w:rPr>
-        <w:t xml:space="preserve">W oparciu o dostępne dane, kryteria klasyfikacji nie są spełnione.</w:t>
-      </w:r>
-    </w:p>
-    <w:p>
-      <w:pPr>
         <w:spacing w:after="100" w:before="200"/>
       </w:pPr>
       <w:r>
@@ -6084,7 +6069,7 @@
           <w:sz w:val="20"/>
           <w:szCs w:val="20"/>
         </w:rPr>
-        <w:t xml:space="preserve">W oparciu o dostępne dane produkt nie zawiera substancji wpisanych do wykazu ustanowionego zgodnie z art. 59 ust. 1 jako posiadające właściwości zaburzające funkcjonowanie układu hormonalnego ani substancji o właściwościach zaburzających funkcjonowanie układu hormonalnego zgodnie z kryteriami określonymi w rozporządzeniu (UE) 2017/2100 lub rozporządzeniu (UE) 2018/605 w stężeniu ≥ 0,1%.</w:t>
+        <w:t xml:space="preserve">W oparciu o dostępne dane produkt nie zawiera substancji wymienionych w głównych europejskich wykazach potencjalnych lub podejrzewanych substancji zaburzających funkcjonowanie układu hormonalnego o ocenianym wpływie na zdrowie człowieka w stężeniu ≥ 0,1%.</w:t>
       </w:r>
     </w:p>
     <w:p>
@@ -9665,7 +9650,7 @@
           <w:sz w:val="20"/>
           <w:szCs w:val="20"/>
         </w:rPr>
-        <w:t xml:space="preserve">Niniejsza karta charakterystyki (wersja 1.0 PL) stanowi wydanie pierwsze w języku polskim, opracowane na podstawie karty charakterystyki SDS producenta.</w:t>
+        <w:t xml:space="preserve">Niniejsza karta charakterystyki (wersja 1.0 PL) stanowi wydanie pierwsze w języku polskim, opracowane na podstawie karty charakterystyki SDS producenta z dnia 14.02.2025 r.</w:t>
       </w:r>
     </w:p>
     <w:p>

</xml_diff>